<commit_message>
Adding the leaderboard kaggle status in the report
</commit_message>
<xml_diff>
--- a/Smart_MCQ_Solver_Project_Report.docx
+++ b/Smart_MCQ_Solver_Project_Report.docx
@@ -114,7 +114,7 @@
         <w:spacing w:after="160"/>
       </w:pPr>
       <w:r>
-        <w:t xml:space="preserve">The main takeaway is that a large pretrained backbone achieves near-ceiling performance on this dataset with minimal fine-tuning — and that this ceiling is not specific to one backbone, since two different pretrained transformers converge to the same score — while a much smaller from-scratch model can still reach a strong MAP@3 through architecture and training-procedure choices alone. EDA raised a caveat that all three models may partly be exploiting an answer-length shortcut present in the data (Section 3.2), which future work should control for.</w:t>
+        <w:t xml:space="preserve">The main takeaway is that a large pretrained backbone achieves near-ceiling performance on this dataset with minimal fine-tuning — and that this ceiling is not specific to one backbone, since two different pretrained transformers converge to the same score — while a much smaller from-scratch model can still reach a strong MAP@3 through architecture and training-procedure choices alone. However, actual Kaggle public leaderboard scores tell a materially different story than validation did: all four submissions scored between 0.72 and 0.76 MAP@3 on the public leaderboard, far below every validation/OOF estimate in this report (0.958–0.998). This gap, and a reversal where the augmented 5-fold LSTM scored lower on the leaderboard than the simpler single-split LSTM despite a higher OOF score, are discussed in Section 6.4 and point to train/validation leakage — most likely from the 242 duplicate and 183 fully-duplicate prompts identified in EDA (Section 3.2) — as the dominant issue to fix before any of the validation numbers in this report should be trusted at face value.</w:t>
       </w:r>
     </w:p>
     <w:p>
@@ -5538,7 +5538,7 @@
         <w:spacing w:after="160"/>
       </w:pPr>
       <w:r>
-        <w:t xml:space="preserve">The clearest trade-off in the table is scale versus effort: both pretrained transformers reach near-ceiling MAP@3 (0.998) via LoRA fine-tuning, but DeBERTa gets there in 8 epochs (~26 min) versus RoBERTa's 20 epochs (~1h 45m) — roughly 4x the wall-clock for an identical final score. That the two backbones converge to the same MAP@3 despite different architectures and training lengths suggests this dataset has a genuine ceiling near 0.998 for pretrained transformers under this fine-tuning recipe, rather than one backbone being meaningfully better suited to the task. The from-scratch BiLSTM, with roughly 1/560th as many trainable parameters and no pretrained weights or GPU dependency, still reaches ~0.96 MAP@3, and closes part of the remaining gap (0.9583 → 0.9633) purely through training procedure — 5-fold bagging, option-shuffle augmentation, and test-time augmentation — without changing the architecture at all. Given the answer-length signal noted in Section 3.2, some portion of all three models' scores may reflect that shortcut rather than semantic reasoning; this is worth controlling for before treating any of these numbers as a ceiling on the task's real difficulty.</w:t>
+        <w:t xml:space="preserve">The clearest trade-off in the table is scale versus effort: both pretrained transformers reach near-ceiling validation MAP@3 (0.998) via LoRA fine-tuning, but DeBERTa gets there in 8 epochs (~26 min) versus RoBERTa's 20 epochs (~1h 45m) — roughly 4x the wall-clock for an identical validation score. On validation alone this suggests the two backbones are interchangeable for this task; Section 6.4's Kaggle leaderboard results complicate that conclusion and should be read alongside this table rather than in isolation. The from-scratch BiLSTM, with roughly 1/560th as many trainable parameters and no pretrained weights or GPU dependency, still reaches ~0.96 MAP@3 on validation. Given the answer-length signal noted in Section 3.2 and the leaderboard gap discussed in Section 6.4, none of the validation numbers in this table should be treated as a reliable ceiling on the task's real difficulty until the train/validation leakage is addressed.</w:t>
       </w:r>
     </w:p>
     <w:p>
@@ -5552,40 +5552,514 @@
     </w:p>
     <w:p>
       <w:pPr>
-        <w:pBdr>
-          <w:top w:val="single" w:color="B03A2E" w:sz="4"/>
-          <w:bottom w:val="single" w:color="B03A2E" w:sz="4"/>
-          <w:left w:val="single" w:color="B03A2E" w:sz="4"/>
-          <w:right w:val="single" w:color="B03A2E" w:sz="4"/>
-        </w:pBdr>
-        <w:shd w:fill="FDEDEC" w:val="clear"/>
-        <w:spacing w:after="200" w:before="100"/>
-      </w:pPr>
-      <w:r>
-        <w:rPr>
-          <w:i/>
-          <w:iCs/>
-          <w:color w:val="B03A2E"/>
-        </w:rPr>
-        <w:t xml:space="preserve">[PLACEHOLDER] Final Kaggle leaderboard score and rank not yet recorded in the source notebooks — insert once the best submission.csv has been scored on the public/private leaderboard.</w:t>
-      </w:r>
-    </w:p>
-    <w:p>
-      <w:pPr>
-        <w:pStyle w:val="Heading1"/>
-        <w:spacing w:after="160" w:before="360"/>
-      </w:pPr>
-      <w:r>
-        <w:t xml:space="preserve">7. Conclusion &amp; Future Work</w:t>
-      </w:r>
-    </w:p>
-    <w:p>
-      <w:pPr>
-        <w:pStyle w:val="Heading2"/>
-        <w:spacing w:after="120" w:before="260"/>
-      </w:pPr>
-      <w:r>
-        <w:t xml:space="preserve">7.1 Key Learnings</w:t>
+        <w:spacing w:after="160"/>
+      </w:pPr>
+      <w:r>
+        <w:t xml:space="preserve">Four submissions were scored on the competition's public leaderboard:</w:t>
+      </w:r>
+    </w:p>
+    <w:tbl>
+      <w:tblPr>
+        <w:tblW w:type="dxa" w:w="9850"/>
+        <w:tblBorders>
+          <w:top w:val="single" w:color="auto" w:sz="4"/>
+          <w:left w:val="single" w:color="auto" w:sz="4"/>
+          <w:bottom w:val="single" w:color="auto" w:sz="4"/>
+          <w:right w:val="single" w:color="auto" w:sz="4"/>
+          <w:insideH w:val="single" w:color="auto" w:sz="4"/>
+          <w:insideV w:val="single" w:color="auto" w:sz="4"/>
+        </w:tblBorders>
+      </w:tblPr>
+      <w:tblGrid>
+        <w:gridCol w:w="3600"/>
+        <w:gridCol w:w="1900"/>
+        <w:gridCol w:w="1900"/>
+        <w:gridCol w:w="2450"/>
+      </w:tblGrid>
+      <w:tr>
+        <w:trPr>
+          <w:tblHeader/>
+        </w:trPr>
+        <w:tc>
+          <w:tcPr>
+            <w:tcW w:type="dxa" w:w="3600"/>
+            <w:shd w:fill="2E5E9E" w:val="clear"/>
+            <w:tcMar>
+              <w:top w:type="dxa" w:w="80"/>
+              <w:left w:type="dxa" w:w="100"/>
+              <w:bottom w:type="dxa" w:w="80"/>
+              <w:right w:type="dxa" w:w="100"/>
+            </w:tcMar>
+          </w:tcPr>
+          <w:p>
+            <w:r>
+              <w:rPr>
+                <w:b/>
+                <w:bCs/>
+                <w:color w:val="FFFFFF"/>
+                <w:sz w:val="19"/>
+                <w:szCs w:val="19"/>
+              </w:rPr>
+              <w:t xml:space="preserve">Model / Submission</w:t>
+            </w:r>
+          </w:p>
+        </w:tc>
+        <w:tc>
+          <w:tcPr>
+            <w:tcW w:type="dxa" w:w="1900"/>
+            <w:shd w:fill="2E5E9E" w:val="clear"/>
+            <w:tcMar>
+              <w:top w:type="dxa" w:w="80"/>
+              <w:left w:type="dxa" w:w="100"/>
+              <w:bottom w:type="dxa" w:w="80"/>
+              <w:right w:type="dxa" w:w="100"/>
+            </w:tcMar>
+          </w:tcPr>
+          <w:p>
+            <w:r>
+              <w:rPr>
+                <w:b/>
+                <w:bCs/>
+                <w:color w:val="FFFFFF"/>
+                <w:sz w:val="19"/>
+                <w:szCs w:val="19"/>
+              </w:rPr>
+              <w:t xml:space="preserve">Val or OOF MAP@3</w:t>
+            </w:r>
+          </w:p>
+        </w:tc>
+        <w:tc>
+          <w:tcPr>
+            <w:tcW w:type="dxa" w:w="1900"/>
+            <w:shd w:fill="2E5E9E" w:val="clear"/>
+            <w:tcMar>
+              <w:top w:type="dxa" w:w="80"/>
+              <w:left w:type="dxa" w:w="100"/>
+              <w:bottom w:type="dxa" w:w="80"/>
+              <w:right w:type="dxa" w:w="100"/>
+            </w:tcMar>
+          </w:tcPr>
+          <w:p>
+            <w:r>
+              <w:rPr>
+                <w:b/>
+                <w:bCs/>
+                <w:color w:val="FFFFFF"/>
+                <w:sz w:val="19"/>
+                <w:szCs w:val="19"/>
+              </w:rPr>
+              <w:t xml:space="preserve">Kaggle Public MAP@3</w:t>
+            </w:r>
+          </w:p>
+        </w:tc>
+        <w:tc>
+          <w:tcPr>
+            <w:tcW w:type="dxa" w:w="2450"/>
+            <w:shd w:fill="2E5E9E" w:val="clear"/>
+            <w:tcMar>
+              <w:top w:type="dxa" w:w="80"/>
+              <w:left w:type="dxa" w:w="100"/>
+              <w:bottom w:type="dxa" w:w="80"/>
+              <w:right w:type="dxa" w:w="100"/>
+            </w:tcMar>
+          </w:tcPr>
+          <w:p>
+            <w:r>
+              <w:rPr>
+                <w:b/>
+                <w:bCs/>
+                <w:color w:val="FFFFFF"/>
+                <w:sz w:val="19"/>
+                <w:szCs w:val="19"/>
+              </w:rPr>
+              <w:t xml:space="preserve">Notes</w:t>
+            </w:r>
+          </w:p>
+        </w:tc>
+      </w:tr>
+      <w:tr>
+        <w:tc>
+          <w:tcPr>
+            <w:tcW w:type="dxa" w:w="3600"/>
+            <w:tcMar>
+              <w:top w:type="dxa" w:w="80"/>
+              <w:left w:type="dxa" w:w="100"/>
+              <w:bottom w:type="dxa" w:w="80"/>
+              <w:right w:type="dxa" w:w="100"/>
+            </w:tcMar>
+          </w:tcPr>
+          <w:p>
+            <w:r>
+              <w:rPr>
+                <w:b w:val="false"/>
+                <w:bCs w:val="false"/>
+                <w:sz w:val="18"/>
+                <w:szCs w:val="18"/>
+              </w:rPr>
+              <w:t xml:space="preserve">DeBERTa-v3-large + LoRA (final_deberta_8_epoch_run)</w:t>
+            </w:r>
+          </w:p>
+        </w:tc>
+        <w:tc>
+          <w:tcPr>
+            <w:tcW w:type="dxa" w:w="1900"/>
+            <w:tcMar>
+              <w:top w:type="dxa" w:w="80"/>
+              <w:left w:type="dxa" w:w="100"/>
+              <w:bottom w:type="dxa" w:w="80"/>
+              <w:right w:type="dxa" w:w="100"/>
+            </w:tcMar>
+          </w:tcPr>
+          <w:p>
+            <w:r>
+              <w:rPr>
+                <w:b w:val="false"/>
+                <w:bCs w:val="false"/>
+                <w:sz w:val="18"/>
+                <w:szCs w:val="18"/>
+              </w:rPr>
+              <w:t xml:space="preserve">0.9983</w:t>
+            </w:r>
+          </w:p>
+        </w:tc>
+        <w:tc>
+          <w:tcPr>
+            <w:tcW w:type="dxa" w:w="1900"/>
+            <w:tcMar>
+              <w:top w:type="dxa" w:w="80"/>
+              <w:left w:type="dxa" w:w="100"/>
+              <w:bottom w:type="dxa" w:w="80"/>
+              <w:right w:type="dxa" w:w="100"/>
+            </w:tcMar>
+          </w:tcPr>
+          <w:p>
+            <w:r>
+              <w:rPr>
+                <w:b w:val="false"/>
+                <w:bCs w:val="false"/>
+                <w:sz w:val="18"/>
+                <w:szCs w:val="18"/>
+              </w:rPr>
+              <w:t xml:space="preserve">0.76101</w:t>
+            </w:r>
+          </w:p>
+        </w:tc>
+        <w:tc>
+          <w:tcPr>
+            <w:tcW w:type="dxa" w:w="2450"/>
+            <w:tcMar>
+              <w:top w:type="dxa" w:w="80"/>
+              <w:left w:type="dxa" w:w="100"/>
+              <w:bottom w:type="dxa" w:w="80"/>
+              <w:right w:type="dxa" w:w="100"/>
+            </w:tcMar>
+          </w:tcPr>
+          <w:p>
+            <w:r>
+              <w:rPr>
+                <w:b w:val="false"/>
+                <w:bCs w:val="false"/>
+                <w:sz w:val="18"/>
+                <w:szCs w:val="18"/>
+              </w:rPr>
+              <w:t xml:space="preserve">8 epochs — best leaderboard score</w:t>
+            </w:r>
+          </w:p>
+        </w:tc>
+      </w:tr>
+      <w:tr>
+        <w:tc>
+          <w:tcPr>
+            <w:tcW w:type="dxa" w:w="3600"/>
+            <w:shd w:fill="F4F7FB" w:val="clear"/>
+            <w:tcMar>
+              <w:top w:type="dxa" w:w="80"/>
+              <w:left w:type="dxa" w:w="100"/>
+              <w:bottom w:type="dxa" w:w="80"/>
+              <w:right w:type="dxa" w:w="100"/>
+            </w:tcMar>
+          </w:tcPr>
+          <w:p>
+            <w:r>
+              <w:rPr>
+                <w:b w:val="false"/>
+                <w:bCs w:val="false"/>
+                <w:sz w:val="18"/>
+                <w:szCs w:val="18"/>
+              </w:rPr>
+              <w:t xml:space="preserve">RoBERTa-large + LoRA (version 3)</w:t>
+            </w:r>
+          </w:p>
+        </w:tc>
+        <w:tc>
+          <w:tcPr>
+            <w:tcW w:type="dxa" w:w="1900"/>
+            <w:shd w:fill="F4F7FB" w:val="clear"/>
+            <w:tcMar>
+              <w:top w:type="dxa" w:w="80"/>
+              <w:left w:type="dxa" w:w="100"/>
+              <w:bottom w:type="dxa" w:w="80"/>
+              <w:right w:type="dxa" w:w="100"/>
+            </w:tcMar>
+          </w:tcPr>
+          <w:p>
+            <w:r>
+              <w:rPr>
+                <w:b w:val="false"/>
+                <w:bCs w:val="false"/>
+                <w:sz w:val="18"/>
+                <w:szCs w:val="18"/>
+              </w:rPr>
+              <w:t xml:space="preserve">0.9983</w:t>
+            </w:r>
+          </w:p>
+        </w:tc>
+        <w:tc>
+          <w:tcPr>
+            <w:tcW w:type="dxa" w:w="1900"/>
+            <w:shd w:fill="F4F7FB" w:val="clear"/>
+            <w:tcMar>
+              <w:top w:type="dxa" w:w="80"/>
+              <w:left w:type="dxa" w:w="100"/>
+              <w:bottom w:type="dxa" w:w="80"/>
+              <w:right w:type="dxa" w:w="100"/>
+            </w:tcMar>
+          </w:tcPr>
+          <w:p>
+            <w:r>
+              <w:rPr>
+                <w:b w:val="false"/>
+                <w:bCs w:val="false"/>
+                <w:sz w:val="18"/>
+                <w:szCs w:val="18"/>
+              </w:rPr>
+              <w:t xml:space="preserve">0.74729</w:t>
+            </w:r>
+          </w:p>
+        </w:tc>
+        <w:tc>
+          <w:tcPr>
+            <w:tcW w:type="dxa" w:w="2450"/>
+            <w:shd w:fill="F4F7FB" w:val="clear"/>
+            <w:tcMar>
+              <w:top w:type="dxa" w:w="80"/>
+              <w:left w:type="dxa" w:w="100"/>
+              <w:bottom w:type="dxa" w:w="80"/>
+              <w:right w:type="dxa" w:w="100"/>
+            </w:tcMar>
+          </w:tcPr>
+          <w:p>
+            <w:r>
+              <w:rPr>
+                <w:b w:val="false"/>
+                <w:bCs w:val="false"/>
+                <w:sz w:val="18"/>
+                <w:szCs w:val="18"/>
+              </w:rPr>
+              <w:t xml:space="preserve">20 epochs</w:t>
+            </w:r>
+          </w:p>
+        </w:tc>
+      </w:tr>
+      <w:tr>
+        <w:tc>
+          <w:tcPr>
+            <w:tcW w:type="dxa" w:w="3600"/>
+            <w:tcMar>
+              <w:top w:type="dxa" w:w="80"/>
+              <w:left w:type="dxa" w:w="100"/>
+              <w:bottom w:type="dxa" w:w="80"/>
+              <w:right w:type="dxa" w:w="100"/>
+            </w:tcMar>
+          </w:tcPr>
+          <w:p>
+            <w:r>
+              <w:rPr>
+                <w:b w:val="false"/>
+                <w:bCs w:val="false"/>
+                <w:sz w:val="18"/>
+                <w:szCs w:val="18"/>
+              </w:rPr>
+              <w:t xml:space="preserve">Siamese BiLSTM, single split (submission.csv)</w:t>
+            </w:r>
+          </w:p>
+        </w:tc>
+        <w:tc>
+          <w:tcPr>
+            <w:tcW w:type="dxa" w:w="1900"/>
+            <w:tcMar>
+              <w:top w:type="dxa" w:w="80"/>
+              <w:left w:type="dxa" w:w="100"/>
+              <w:bottom w:type="dxa" w:w="80"/>
+              <w:right w:type="dxa" w:w="100"/>
+            </w:tcMar>
+          </w:tcPr>
+          <w:p>
+            <w:r>
+              <w:rPr>
+                <w:b w:val="false"/>
+                <w:bCs w:val="false"/>
+                <w:sz w:val="18"/>
+                <w:szCs w:val="18"/>
+              </w:rPr>
+              <w:t xml:space="preserve">0.9583</w:t>
+            </w:r>
+          </w:p>
+        </w:tc>
+        <w:tc>
+          <w:tcPr>
+            <w:tcW w:type="dxa" w:w="1900"/>
+            <w:tcMar>
+              <w:top w:type="dxa" w:w="80"/>
+              <w:left w:type="dxa" w:w="100"/>
+              <w:bottom w:type="dxa" w:w="80"/>
+              <w:right w:type="dxa" w:w="100"/>
+            </w:tcMar>
+          </w:tcPr>
+          <w:p>
+            <w:r>
+              <w:rPr>
+                <w:b w:val="false"/>
+                <w:bCs w:val="false"/>
+                <w:sz w:val="18"/>
+                <w:szCs w:val="18"/>
+              </w:rPr>
+              <w:t xml:space="preserve">0.72402</w:t>
+            </w:r>
+          </w:p>
+        </w:tc>
+        <w:tc>
+          <w:tcPr>
+            <w:tcW w:type="dxa" w:w="2450"/>
+            <w:tcMar>
+              <w:top w:type="dxa" w:w="80"/>
+              <w:left w:type="dxa" w:w="100"/>
+              <w:bottom w:type="dxa" w:w="80"/>
+              <w:right w:type="dxa" w:w="100"/>
+            </w:tcMar>
+          </w:tcPr>
+          <w:p>
+            <w:r>
+              <w:rPr>
+                <w:b w:val="false"/>
+                <w:bCs w:val="false"/>
+                <w:sz w:val="18"/>
+                <w:szCs w:val="18"/>
+              </w:rPr>
+              <w:t xml:space="preserve">no aug/TTA</w:t>
+            </w:r>
+          </w:p>
+        </w:tc>
+      </w:tr>
+      <w:tr>
+        <w:tc>
+          <w:tcPr>
+            <w:tcW w:type="dxa" w:w="3600"/>
+            <w:shd w:fill="F4F7FB" w:val="clear"/>
+            <w:tcMar>
+              <w:top w:type="dxa" w:w="80"/>
+              <w:left w:type="dxa" w:w="100"/>
+              <w:bottom w:type="dxa" w:w="80"/>
+              <w:right w:type="dxa" w:w="100"/>
+            </w:tcMar>
+          </w:tcPr>
+          <w:p>
+            <w:r>
+              <w:rPr>
+                <w:b w:val="false"/>
+                <w:bCs w:val="false"/>
+                <w:sz w:val="18"/>
+                <w:szCs w:val="18"/>
+              </w:rPr>
+              <w:t xml:space="preserve">Siamese BiLSTM, 5-fold (submission_lstm_5v.csv)</w:t>
+            </w:r>
+          </w:p>
+        </w:tc>
+        <w:tc>
+          <w:tcPr>
+            <w:tcW w:type="dxa" w:w="1900"/>
+            <w:shd w:fill="F4F7FB" w:val="clear"/>
+            <w:tcMar>
+              <w:top w:type="dxa" w:w="80"/>
+              <w:left w:type="dxa" w:w="100"/>
+              <w:bottom w:type="dxa" w:w="80"/>
+              <w:right w:type="dxa" w:w="100"/>
+            </w:tcMar>
+          </w:tcPr>
+          <w:p>
+            <w:r>
+              <w:rPr>
+                <w:b w:val="false"/>
+                <w:bCs w:val="false"/>
+                <w:sz w:val="18"/>
+                <w:szCs w:val="18"/>
+              </w:rPr>
+              <w:t xml:space="preserve">0.9633 (OOF)</w:t>
+            </w:r>
+          </w:p>
+        </w:tc>
+        <w:tc>
+          <w:tcPr>
+            <w:tcW w:type="dxa" w:w="1900"/>
+            <w:shd w:fill="F4F7FB" w:val="clear"/>
+            <w:tcMar>
+              <w:top w:type="dxa" w:w="80"/>
+              <w:left w:type="dxa" w:w="100"/>
+              <w:bottom w:type="dxa" w:w="80"/>
+              <w:right w:type="dxa" w:w="100"/>
+            </w:tcMar>
+          </w:tcPr>
+          <w:p>
+            <w:r>
+              <w:rPr>
+                <w:b w:val="false"/>
+                <w:bCs w:val="false"/>
+                <w:sz w:val="18"/>
+                <w:szCs w:val="18"/>
+              </w:rPr>
+              <w:t xml:space="preserve">0.71986</w:t>
+            </w:r>
+          </w:p>
+        </w:tc>
+        <w:tc>
+          <w:tcPr>
+            <w:tcW w:type="dxa" w:w="2450"/>
+            <w:shd w:fill="F4F7FB" w:val="clear"/>
+            <w:tcMar>
+              <w:top w:type="dxa" w:w="80"/>
+              <w:left w:type="dxa" w:w="100"/>
+              <w:bottom w:type="dxa" w:w="80"/>
+              <w:right w:type="dxa" w:w="100"/>
+            </w:tcMar>
+          </w:tcPr>
+          <w:p>
+            <w:r>
+              <w:rPr>
+                <w:b w:val="false"/>
+                <w:bCs w:val="false"/>
+                <w:sz w:val="18"/>
+                <w:szCs w:val="18"/>
+              </w:rPr>
+              <w:t xml:space="preserve">option-shuffle aug + 5-fold bagging + 5x TTA</w:t>
+            </w:r>
+          </w:p>
+        </w:tc>
+      </w:tr>
+    </w:tbl>
+    <w:p>
+      <w:pPr>
+        <w:spacing w:after="160"/>
+      </w:pPr>
+      <w:r>
+        <w:t xml:space="preserve"/>
+      </w:r>
+    </w:p>
+    <w:p>
+      <w:pPr>
+        <w:spacing w:after="160"/>
+      </w:pPr>
+      <w:r>
+        <w:t xml:space="preserve">Two things stand out, and both matter more than any single score above:</w:t>
       </w:r>
     </w:p>
     <w:p>
@@ -5598,7 +6072,7 @@
         <w:spacing w:after="80"/>
       </w:pPr>
       <w:r>
-        <w:t xml:space="preserve">Parameter-efficient fine-tuning (LoRA) can adapt a large pretrained transformer to a new task while training well under 1% of its parameters, and still reach near-ceiling performance in a handful of epochs.</w:t>
+        <w:t xml:space="preserve">Every validation/OOF estimate in this report (0.958–0.998) is far higher than any Kaggle public score (0.720–0.761). A gap this large — roughly 0.22–0.28 MAP@3 — is not normal fine-tuning variance; it strongly suggests the train/validation split is leaking information the public test set does not share. The most likely cause is the 242 duplicate-prompt / 183 fully-duplicate rows identified in Section 3.2: because the current split is label-stratified but not group-aware, a duplicate of a training-set prompt can land in the validation set, letting the model “memorize” rather than generalize, and inflating every validation score in this report.</w:t>
       </w:r>
     </w:p>
     <w:p>
@@ -5611,7 +6085,7 @@
         <w:spacing w:after="80"/>
       </w:pPr>
       <w:r>
-        <w:t xml:space="preserve">A carefully designed from-scratch model can close a meaningful part of the gap to a pretrained transformer through training procedure alone (cross-validation, augmentation, TTA) without any architecture change.</w:t>
+        <w:t xml:space="preserve">The 5-fold, augmented BiLSTM scored lower on the leaderboard (0.71986) than the simpler single-split BiLSTM (0.72402), even though its OOF validation score was higher (0.9633 vs. 0.9583). This is a reversal of the recommendation in Section 5.2 and is worth taking seriously rather than explaining away: either the option-shuffle augmentation or the 5x TTA (or both) may be smoothing over a signal that the public test set actually rewards, or the 5-fold OOF estimate is itself still inflated by the same duplicate-prompt leakage and so isn't as trustworthy a comparison as intended. Section 5.2's claim that the 5-fold run is the more reliable of the two should be read as provisional until this is investigated — on the one score that matters (the leaderboard), the plainer model won here.</w:t>
       </w:r>
     </w:p>
     <w:p>
@@ -5624,7 +6098,25 @@
         <w:spacing w:after="80"/>
       </w:pPr>
       <w:r>
-        <w:t xml:space="preserve">Out-of-fold evaluation via k-fold CV gives a materially more trustworthy performance estimate than a single train/validation split, and is worth the added compute even for smaller models.</w:t>
+        <w:t xml:space="preserve">Among the two transformers, DeBERTa outperformed RoBERTa on the leaderboard by 1.4 points (0.761 vs. 0.747) despite both scoring identically on validation (0.9983 each). This contradicts the Section 5.3/7.1 framing that the two backbones are interchangeable — that framing held on validation but not on held-out data, which is itself further evidence that the validation split is not a reliable stand-in for real generalization here.</w:t>
+      </w:r>
+    </w:p>
+    <w:p>
+      <w:pPr>
+        <w:pStyle w:val="Heading1"/>
+        <w:spacing w:after="160" w:before="360"/>
+      </w:pPr>
+      <w:r>
+        <w:t xml:space="preserve">7. Conclusion &amp; Future Work</w:t>
+      </w:r>
+    </w:p>
+    <w:p>
+      <w:pPr>
+        <w:pStyle w:val="Heading2"/>
+        <w:spacing w:after="120" w:before="260"/>
+      </w:pPr>
+      <w:r>
+        <w:t xml:space="preserve">7.1 Key Learnings</w:t>
       </w:r>
     </w:p>
     <w:p>
@@ -5637,16 +6129,7 @@
         <w:spacing w:after="80"/>
       </w:pPr>
       <w:r>
-        <w:t xml:space="preserve">Two different pretrained transformer backbones (DeBERTa-v3-large, RoBERTa-large), fine-tuned with an identical LoRA recipe, converged to the same MAP@3 (0.9983) — evidence that near-ceiling performance here is a property of the dataset/approach rather than one specific architecture, though RoBERTa needed ~4x the training time to get there.</w:t>
-      </w:r>
-    </w:p>
-    <w:p>
-      <w:pPr>
-        <w:pStyle w:val="Heading2"/>
-        <w:spacing w:after="120" w:before="260"/>
-      </w:pPr>
-      <w:r>
-        <w:t xml:space="preserve">7.2 Challenges Faced</w:t>
+        <w:t xml:space="preserve">Parameter-efficient fine-tuning (LoRA) can adapt a large pretrained transformer to a new task while training well under 1% of its parameters, and still reach near-ceiling performance in a handful of epochs.</w:t>
       </w:r>
     </w:p>
     <w:p>
@@ -5659,7 +6142,7 @@
         <w:spacing w:after="80"/>
       </w:pPr>
       <w:r>
-        <w:t xml:space="preserve">Mild class imbalance in the answer distribution (B and C over-represented relative to E).</w:t>
+        <w:t xml:space="preserve">A carefully designed from-scratch model can close a meaningful part of the gap to a pretrained transformer through training procedure alone (cross-validation, augmentation, TTA) without any architecture change.</w:t>
       </w:r>
     </w:p>
     <w:p>
@@ -5672,7 +6155,7 @@
         <w:spacing w:after="80"/>
       </w:pPr>
       <w:r>
-        <w:t xml:space="preserve">242 duplicate prompts and 183 fully duplicate rows in train.csv, which risk leakage between a naive train/validation split; the current split is label-stratified but not group-aware (duplicates of the same prompt can end up on both sides of the split).</w:t>
+        <w:t xml:space="preserve">Out-of-fold evaluation via k-fold CV gives a materially more trustworthy performance estimate than a single train/validation split, and is worth the added compute even for smaller models.</w:t>
       </w:r>
     </w:p>
     <w:p>
@@ -5685,7 +6168,7 @@
         <w:spacing w:after="80"/>
       </w:pPr>
       <w:r>
-        <w:t xml:space="preserve">An apparent length bias where correct answers average ~10–12% longer than distractors, a possible shortcut-learning risk for all three models.</w:t>
+        <w:t xml:space="preserve">Two different pretrained transformer backbones (DeBERTa-v3-large, RoBERTa-large), fine-tuned with an identical LoRA recipe, converged to the same validation MAP@3 (0.9983) — but this apparent equivalence did not hold on the Kaggle public leaderboard, where DeBERTa outperformed RoBERTa by 1.4 points (Section 6.4). Validation-set agreement between models is not sufficient evidence that they generalize equally.</w:t>
       </w:r>
     </w:p>
     <w:p>
@@ -5698,7 +6181,7 @@
         <w:spacing w:after="80"/>
       </w:pPr>
       <w:r>
-        <w:t xml:space="preserve">Both DeBERTa and RoBERTa were evaluated on a single train/validation split, unlike the BiLSTM's 5-fold OOF evaluation — an asymmetry in evaluation rigor across the models that limits a fully fair comparison.</w:t>
+        <w:t xml:space="preserve">The single biggest lesson from this project is that validation MAP@3 (0.958–0.998 across all four models) and Kaggle public MAP@3 (0.720–0.761) diverged enormously — a reminder that a validation split sharing rows with the training set (via duplicate prompts) can look excellent while telling you almost nothing about real generalization.</w:t>
       </w:r>
     </w:p>
     <w:p>
@@ -5707,7 +6190,7 @@
         <w:spacing w:after="120" w:before="260"/>
       </w:pPr>
       <w:r>
-        <w:t xml:space="preserve">7.3 Areas for Improvement</w:t>
+        <w:t xml:space="preserve">7.2 Challenges Faced</w:t>
       </w:r>
     </w:p>
     <w:p>
@@ -5720,7 +6203,7 @@
         <w:spacing w:after="80"/>
       </w:pPr>
       <w:r>
-        <w:t xml:space="preserve">Add group-aware (prompt-deduplicated) k-fold cross-validation to the DeBERTa run to match the rigor of the BiLSTM evaluation and remove any duplicate-prompt leakage risk.</w:t>
+        <w:t xml:space="preserve">Mild class imbalance in the answer distribution (B and C over-represented relative to E).</w:t>
       </w:r>
     </w:p>
     <w:p>
@@ -5733,7 +6216,7 @@
         <w:spacing w:after="80"/>
       </w:pPr>
       <w:r>
-        <w:t xml:space="preserve">Run a length-controlled ablation (e.g. truncating/padding options to equal length) to quantify how much of either model's MAP@3 comes from the answer-length shortcut versus genuine reasoning.</w:t>
+        <w:t xml:space="preserve">242 duplicate prompts and 183 fully duplicate rows in train.csv, which risk leakage between a naive train/validation split; the current split is label-stratified but not group-aware (duplicates of the same prompt can end up on both sides of the split). Kaggle leaderboard scores (Section 6.4) landing 0.22–0.28 MAP@3 below every validation estimate is consistent with this leakage actually happening, not just a theoretical risk.</w:t>
       </w:r>
     </w:p>
     <w:p>
@@ -5746,7 +6229,7 @@
         <w:spacing w:after="80"/>
       </w:pPr>
       <w:r>
-        <w:t xml:space="preserve">Build a weighted or rank-fusion ensemble of DeBERTa, RoBERTa, and the BiLSTM predictions — a natural next step now that three independently-trained models exist on the same split, and likely the highest-leverage remaining improvement given how close DeBERTa and RoBERTa already are individually.</w:t>
+        <w:t xml:space="preserve">An apparent length bias where correct answers average ~10–12% longer than distractors, a possible shortcut-learning risk for all three models.</w:t>
       </w:r>
     </w:p>
     <w:p>
@@ -5759,7 +6242,7 @@
         <w:spacing w:after="80"/>
       </w:pPr>
       <w:r>
-        <w:t xml:space="preserve">Export Weights &amp; Biases training curves as images for a more complete Section 6.2.</w:t>
+        <w:t xml:space="preserve">Both DeBERTa and RoBERTa were evaluated on a single train/validation split, unlike the BiLSTM's 5-fold OOF evaluation — an asymmetry in evaluation rigor across the models that limits a fully fair comparison.</w:t>
       </w:r>
     </w:p>
     <w:p>
@@ -5772,7 +6255,94 @@
         <w:spacing w:after="80"/>
       </w:pPr>
       <w:r>
-        <w:t xml:space="preserve">Explore post-training quantization of the DeBERTa or RoBERTa model for cheaper inference, given the near-ceiling accuracy leaves headroom to trade a little accuracy for speed.</w:t>
+        <w:t xml:space="preserve">The BiLSTM's 5-fold, augmented run scored lower on the public leaderboard than its simpler single-split predecessor, despite a higher validation score — the opposite of what the added cross-validation, augmentation, and TTA were meant to achieve (Section 6.4).</w:t>
+      </w:r>
+    </w:p>
+    <w:p>
+      <w:pPr>
+        <w:pStyle w:val="Heading2"/>
+        <w:spacing w:after="120" w:before="260"/>
+      </w:pPr>
+      <w:r>
+        <w:t xml:space="preserve">7.3 Areas for Improvement</w:t>
+      </w:r>
+    </w:p>
+    <w:p>
+      <w:pPr>
+        <w:pStyle w:val="ListParagraph"/>
+        <w:numPr>
+          <w:ilvl w:val="0"/>
+          <w:numId w:val="2"/>
+        </w:numPr>
+        <w:spacing w:after="80"/>
+      </w:pPr>
+      <w:r>
+        <w:t xml:space="preserve">Highest priority: rebuild the train/validation split (and the LSTM's k-folds) to be group-aware — deduplicated by prompt — rather than only label-stratified, and re-measure all four models. Given the leaderboard-vs-validation gap in Section 6.4, this is likely to change which model actually looks best far more than any architecture change would.</w:t>
+      </w:r>
+    </w:p>
+    <w:p>
+      <w:pPr>
+        <w:pStyle w:val="ListParagraph"/>
+        <w:numPr>
+          <w:ilvl w:val="0"/>
+          <w:numId w:val="2"/>
+        </w:numPr>
+        <w:spacing w:after="80"/>
+      </w:pPr>
+      <w:r>
+        <w:t xml:space="preserve">Investigate why the augmented 5-fold BiLSTM underperformed the simpler single-split BiLSTM on the leaderboard: ablate option-shuffle augmentation and TTA independently to see which (if either) hurt generalization to the real test distribution.</w:t>
+      </w:r>
+    </w:p>
+    <w:p>
+      <w:pPr>
+        <w:pStyle w:val="ListParagraph"/>
+        <w:numPr>
+          <w:ilvl w:val="0"/>
+          <w:numId w:val="2"/>
+        </w:numPr>
+        <w:spacing w:after="80"/>
+      </w:pPr>
+      <w:r>
+        <w:t xml:space="preserve">Run a length-controlled ablation (e.g. truncating/padding options to equal length) to quantify how much of either model's MAP@3 comes from the answer-length shortcut versus genuine reasoning.</w:t>
+      </w:r>
+    </w:p>
+    <w:p>
+      <w:pPr>
+        <w:pStyle w:val="ListParagraph"/>
+        <w:numPr>
+          <w:ilvl w:val="0"/>
+          <w:numId w:val="2"/>
+        </w:numPr>
+        <w:spacing w:after="80"/>
+      </w:pPr>
+      <w:r>
+        <w:t xml:space="preserve">Build a weighted or rank-fusion ensemble of DeBERTa, RoBERTa, and the BiLSTM predictions — best attempted after the leakage fix above, since ensembling three models whose validation scores are all inflated by the same leakage risks compounding rather than fixing the problem.</w:t>
+      </w:r>
+    </w:p>
+    <w:p>
+      <w:pPr>
+        <w:pStyle w:val="ListParagraph"/>
+        <w:numPr>
+          <w:ilvl w:val="0"/>
+          <w:numId w:val="2"/>
+        </w:numPr>
+        <w:spacing w:after="80"/>
+      </w:pPr>
+      <w:r>
+        <w:t xml:space="preserve">Export Weights &amp; Biases training curves as images for a more complete Section 6.2.</w:t>
+      </w:r>
+    </w:p>
+    <w:p>
+      <w:pPr>
+        <w:pStyle w:val="ListParagraph"/>
+        <w:numPr>
+          <w:ilvl w:val="0"/>
+          <w:numId w:val="2"/>
+        </w:numPr>
+        <w:spacing w:after="80"/>
+      </w:pPr>
+      <w:r>
+        <w:t xml:space="preserve">Explore post-training quantization of the DeBERTa or RoBERTa model for cheaper inference, given the near-ceiling validation accuracy leaves headroom to trade a little accuracy for speed — though this is secondary until the leakage issue is resolved.</w:t>
       </w:r>
     </w:p>
     <w:p>

</xml_diff>